<commit_message>
docs(test): resolve all audit violations, fix workbook formulas, synchronize evidence, and update final reports
</commit_message>
<xml_diff>
--- a/23CT113_Nhom02_NenTangCrowdfunding(TuTeFund)/TimeLine/Nhom2_Ke_hoach_Truong_nhom_Bao_cao_cuoi_ky.docx
+++ b/23CT113_Nhom02_NenTangCrowdfunding(TuTeFund)/TimeLine/Nhom2_Ke_hoach_Truong_nhom_Bao_cao_cuoi_ky.docx
@@ -3,17 +3,25 @@
 <w:document xmlns:wpc="http://schemas.microsoft.com/office/word/2010/wordprocessingCanvas" xmlns:mo="http://schemas.microsoft.com/office/mac/office/2008/main" xmlns:mc="http://schemas.openxmlformats.org/markup-compatibility/2006" xmlns:mv="urn:schemas-microsoft-com:mac:vml" xmlns:o="urn:schemas-microsoft-com:office:office" xmlns:r="http://schemas.openxmlformats.org/officeDocument/2006/relationships" xmlns:m="http://schemas.openxmlformats.org/officeDocument/2006/math" xmlns:v="urn:schemas-microsoft-com:vml" xmlns:wp14="http://schemas.microsoft.com/office/word/2010/wordprocessingDrawing" xmlns:wp="http://schemas.openxmlformats.org/drawingml/2006/wordprocessingDrawing" xmlns:w10="urn:schemas-microsoft-com:office:word" xmlns:w="http://schemas.openxmlformats.org/wordprocessingml/2006/main" xmlns:w14="http://schemas.microsoft.com/office/word/2010/wordml" xmlns:wpg="http://schemas.microsoft.com/office/word/2010/wordprocessingGroup" xmlns:wpi="http://schemas.microsoft.com/office/word/2010/wordprocessingInk" xmlns:wne="http://schemas.microsoft.com/office/word/2006/wordml" xmlns:wps="http://schemas.microsoft.com/office/word/2010/wordprocessingShape" mc:Ignorable="w14 wp14">
   <w:body>
     <w:p>
+      <w:pPr>
+        <w:spacing w:line="288" w:lineRule="auto"/>
+      </w:pPr>
       <w:r>
         <w:rPr>
+          <w:rFonts w:ascii="Times New Roman" w:hAnsi="Times New Roman"/>
           <w:b/>
-          <w:sz w:val="22"/>
+          <w:sz w:val="24"/>
         </w:rPr>
         <w:t>TRƯỜNG ĐẠI HỌC LẠC HỒNG - KHOA CÔNG NGHỆ THÔNG TIN</w:t>
       </w:r>
     </w:p>
     <w:p>
+      <w:pPr>
+        <w:spacing w:line="288" w:lineRule="auto"/>
+      </w:pPr>
       <w:r>
         <w:rPr>
+          <w:rFonts w:ascii="Times New Roman" w:hAnsi="Times New Roman"/>
           <w:b/>
           <w:color w:val="1F4E78"/>
           <w:sz w:val="26"/>
@@ -22,27 +30,43 @@
       </w:r>
     </w:p>
     <w:p>
+      <w:pPr>
+        <w:spacing w:line="288" w:lineRule="auto"/>
+      </w:pPr>
       <w:r>
         <w:rPr>
+          <w:rFonts w:ascii="Times New Roman" w:hAnsi="Times New Roman"/>
           <w:i/>
-          <w:sz w:val="22"/>
+          <w:sz w:val="24"/>
         </w:rPr>
         <w:t>Học phần: Kiểm thử và Đảm bảo Chất lượng Phần mềm | Lớp: 23CT113 - Nhóm: Nhóm 02</w:t>
       </w:r>
     </w:p>
     <w:p>
+      <w:pPr>
+        <w:spacing w:line="288" w:lineRule="auto"/>
+      </w:pPr>
       <w:r>
         <w:rPr>
+          <w:rFonts w:ascii="Times New Roman" w:hAnsi="Times New Roman"/>
           <w:b/>
-          <w:sz w:val="22"/>
+          <w:sz w:val="24"/>
         </w:rPr>
         <w:t>Trưởng nhóm: Nguyễn Quách Phú Tài (MSSV: 123000609)</w:t>
       </w:r>
     </w:p>
-    <w:p/>
     <w:p>
+      <w:pPr>
+        <w:spacing w:line="288" w:lineRule="auto"/>
+      </w:pPr>
+    </w:p>
+    <w:p>
+      <w:pPr>
+        <w:spacing w:line="288" w:lineRule="auto"/>
+      </w:pPr>
       <w:r>
         <w:rPr>
+          <w:rFonts w:ascii="Times New Roman" w:hAnsi="Times New Roman"/>
           <w:b/>
           <w:color w:val="1F4E78"/>
           <w:sz w:val="24"/>
@@ -51,9 +75,13 @@
       </w:r>
     </w:p>
     <w:p>
+      <w:pPr>
+        <w:spacing w:line="288" w:lineRule="auto"/>
+      </w:pPr>
       <w:r>
         <w:rPr>
-          <w:sz w:val="23"/>
+          <w:rFonts w:ascii="Times New Roman" w:hAnsi="Times New Roman"/>
+          <w:sz w:val="24"/>
         </w:rPr>
         <w:t>Trong suốt 3 tuần thực hiện dự án (12/10/2026 – 30/10/2026), toàn bộ 5 thành viên Nhóm 02 đã tổ chức 3 phiên họp nhóm và phối hợp chặt chẽ theo quy trình review chéo vòng tròn khép kín (Tài → Ân → Khánh → Tiến → Du → Tài). Nhóm đã bám sát mã nguồn thực tế và thực thi kiểm thử trên Web Demo Vercel cùng môi trường cục bộ để thu thập bằng chứng xác thực.</w:t>
       </w:r>
@@ -61,8 +89,8 @@
     <w:tbl>
       <w:tblPr>
         <w:tblW w:type="auto" w:w="0"/>
+        <w:tblLook w:firstColumn="1" w:firstRow="1" w:lastColumn="0" w:lastRow="0" w:noHBand="0" w:noVBand="1" w:val="04A0"/>
         <w:jc w:val="center"/>
-        <w:tblLook w:firstColumn="1" w:firstRow="1" w:lastColumn="0" w:lastRow="0" w:noHBand="0" w:noVBand="1" w:val="04A0"/>
         <w:tblBorders>
           <w:top w:val="single" w:sz="4" w:space="0" w:color="D3D3D3"/>
           <w:left w:val="single" w:sz="4" w:space="0" w:color="D3D3D3"/>
@@ -109,7 +137,7 @@
                 <w:b/>
                 <w:i w:val="0"/>
                 <w:color w:val="FFFFFF"/>
-                <w:sz w:val="19"/>
+                <w:sz w:val="24"/>
               </w:rPr>
               <w:t>STT</w:t>
             </w:r>
@@ -137,7 +165,7 @@
                 <w:b/>
                 <w:i w:val="0"/>
                 <w:color w:val="FFFFFF"/>
-                <w:sz w:val="19"/>
+                <w:sz w:val="24"/>
               </w:rPr>
               <w:t>Thành viên</w:t>
             </w:r>
@@ -165,7 +193,7 @@
                 <w:b/>
                 <w:i w:val="0"/>
                 <w:color w:val="FFFFFF"/>
-                <w:sz w:val="19"/>
+                <w:sz w:val="24"/>
               </w:rPr>
               <w:t>MSSV</w:t>
             </w:r>
@@ -193,7 +221,7 @@
                 <w:b/>
                 <w:i w:val="0"/>
                 <w:color w:val="FFFFFF"/>
-                <w:sz w:val="19"/>
+                <w:sz w:val="24"/>
               </w:rPr>
               <w:t>Vai trò</w:t>
             </w:r>
@@ -221,7 +249,7 @@
                 <w:b/>
                 <w:i w:val="0"/>
                 <w:color w:val="FFFFFF"/>
-                <w:sz w:val="19"/>
+                <w:sz w:val="24"/>
               </w:rPr>
               <w:t>Nhiệm vụ phân hệ</w:t>
             </w:r>
@@ -249,7 +277,7 @@
                 <w:b/>
                 <w:i w:val="0"/>
                 <w:color w:val="FFFFFF"/>
-                <w:sz w:val="19"/>
+                <w:sz w:val="24"/>
               </w:rPr>
               <w:t>Khối lượng</w:t>
             </w:r>
@@ -277,7 +305,7 @@
                 <w:b/>
                 <w:i w:val="0"/>
                 <w:color w:val="FFFFFF"/>
-                <w:sz w:val="19"/>
+                <w:sz w:val="24"/>
               </w:rPr>
               <w:t>Review chéo</w:t>
             </w:r>
@@ -305,7 +333,7 @@
                 <w:b/>
                 <w:i w:val="0"/>
                 <w:color w:val="FFFFFF"/>
-                <w:sz w:val="19"/>
+                <w:sz w:val="24"/>
               </w:rPr>
               <w:t>Đánh giá</w:t>
             </w:r>
@@ -336,7 +364,7 @@
                 <w:rFonts w:ascii="Times New Roman" w:hAnsi="Times New Roman"/>
                 <w:b w:val="0"/>
                 <w:i w:val="0"/>
-                <w:sz w:val="18"/>
+                <w:sz w:val="24"/>
               </w:rPr>
               <w:t>1</w:t>
             </w:r>
@@ -362,7 +390,7 @@
                 <w:rFonts w:ascii="Times New Roman" w:hAnsi="Times New Roman"/>
                 <w:b w:val="0"/>
                 <w:i w:val="0"/>
-                <w:sz w:val="18"/>
+                <w:sz w:val="24"/>
               </w:rPr>
               <w:t>Nguyễn Quách Phú Tài</w:t>
             </w:r>
@@ -388,7 +416,7 @@
                 <w:rFonts w:ascii="Times New Roman" w:hAnsi="Times New Roman"/>
                 <w:b w:val="0"/>
                 <w:i w:val="0"/>
-                <w:sz w:val="18"/>
+                <w:sz w:val="24"/>
               </w:rPr>
               <w:t>123000609</w:t>
             </w:r>
@@ -414,7 +442,7 @@
                 <w:rFonts w:ascii="Times New Roman" w:hAnsi="Times New Roman"/>
                 <w:b w:val="0"/>
                 <w:i w:val="0"/>
-                <w:sz w:val="18"/>
+                <w:sz w:val="24"/>
               </w:rPr>
               <w:t>Trưởng nhóm</w:t>
             </w:r>
@@ -440,7 +468,7 @@
                 <w:rFonts w:ascii="Times New Roman" w:hAnsi="Times New Roman"/>
                 <w:b w:val="0"/>
                 <w:i w:val="0"/>
-                <w:sz w:val="18"/>
+                <w:sz w:val="24"/>
               </w:rPr>
               <w:t>AUTH &amp; KYC (TR-001 -&gt; TR-009)</w:t>
             </w:r>
@@ -466,7 +494,7 @@
                 <w:rFonts w:ascii="Times New Roman" w:hAnsi="Times New Roman"/>
                 <w:b w:val="0"/>
                 <w:i w:val="0"/>
-                <w:sz w:val="18"/>
+                <w:sz w:val="24"/>
               </w:rPr>
               <w:t>9 TR &amp; 23 TC</w:t>
             </w:r>
@@ -492,7 +520,7 @@
                 <w:rFonts w:ascii="Times New Roman" w:hAnsi="Times New Roman"/>
                 <w:b w:val="0"/>
                 <w:i w:val="0"/>
-                <w:sz w:val="18"/>
+                <w:sz w:val="24"/>
               </w:rPr>
               <w:t>Review cho Trần Xuân Ân</w:t>
             </w:r>
@@ -518,7 +546,7 @@
                 <w:rFonts w:ascii="Times New Roman" w:hAnsi="Times New Roman"/>
                 <w:b w:val="0"/>
                 <w:i w:val="0"/>
-                <w:sz w:val="18"/>
+                <w:sz w:val="24"/>
               </w:rPr>
               <w:t>20/23 TC đã chạy</w:t>
             </w:r>
@@ -549,7 +577,7 @@
                 <w:rFonts w:ascii="Times New Roman" w:hAnsi="Times New Roman"/>
                 <w:b w:val="0"/>
                 <w:i w:val="0"/>
-                <w:sz w:val="18"/>
+                <w:sz w:val="24"/>
               </w:rPr>
               <w:t>2</w:t>
             </w:r>
@@ -575,7 +603,7 @@
                 <w:rFonts w:ascii="Times New Roman" w:hAnsi="Times New Roman"/>
                 <w:b w:val="0"/>
                 <w:i w:val="0"/>
-                <w:sz w:val="18"/>
+                <w:sz w:val="24"/>
               </w:rPr>
               <w:t>Trần Xuân Ân</w:t>
             </w:r>
@@ -601,7 +629,7 @@
                 <w:rFonts w:ascii="Times New Roman" w:hAnsi="Times New Roman"/>
                 <w:b w:val="0"/>
                 <w:i w:val="0"/>
-                <w:sz w:val="18"/>
+                <w:sz w:val="24"/>
               </w:rPr>
               <w:t>123001127</w:t>
             </w:r>
@@ -627,7 +655,7 @@
                 <w:rFonts w:ascii="Times New Roman" w:hAnsi="Times New Roman"/>
                 <w:b w:val="0"/>
                 <w:i w:val="0"/>
-                <w:sz w:val="18"/>
+                <w:sz w:val="24"/>
               </w:rPr>
               <w:t>Thành viên</w:t>
             </w:r>
@@ -653,7 +681,7 @@
                 <w:rFonts w:ascii="Times New Roman" w:hAnsi="Times New Roman"/>
                 <w:b w:val="0"/>
                 <w:i w:val="0"/>
-                <w:sz w:val="18"/>
+                <w:sz w:val="24"/>
               </w:rPr>
               <w:t>CAMP &amp; REWARD (TR-010 -&gt; TR-018)</w:t>
             </w:r>
@@ -679,7 +707,7 @@
                 <w:rFonts w:ascii="Times New Roman" w:hAnsi="Times New Roman"/>
                 <w:b w:val="0"/>
                 <w:i w:val="0"/>
-                <w:sz w:val="18"/>
+                <w:sz w:val="24"/>
               </w:rPr>
               <w:t>9 TR &amp; 24 TC</w:t>
             </w:r>
@@ -705,7 +733,7 @@
                 <w:rFonts w:ascii="Times New Roman" w:hAnsi="Times New Roman"/>
                 <w:b w:val="0"/>
                 <w:i w:val="0"/>
-                <w:sz w:val="18"/>
+                <w:sz w:val="24"/>
               </w:rPr>
               <w:t>Review cho Bùi Đặng Quốc Khánh</w:t>
             </w:r>
@@ -731,7 +759,7 @@
                 <w:rFonts w:ascii="Times New Roman" w:hAnsi="Times New Roman"/>
                 <w:b w:val="0"/>
                 <w:i w:val="0"/>
-                <w:sz w:val="18"/>
+                <w:sz w:val="24"/>
               </w:rPr>
               <w:t>22/24 TC đã chạy</w:t>
             </w:r>
@@ -762,7 +790,7 @@
                 <w:rFonts w:ascii="Times New Roman" w:hAnsi="Times New Roman"/>
                 <w:b w:val="0"/>
                 <w:i w:val="0"/>
-                <w:sz w:val="18"/>
+                <w:sz w:val="24"/>
               </w:rPr>
               <w:t>3</w:t>
             </w:r>
@@ -788,7 +816,7 @@
                 <w:rFonts w:ascii="Times New Roman" w:hAnsi="Times New Roman"/>
                 <w:b w:val="0"/>
                 <w:i w:val="0"/>
-                <w:sz w:val="18"/>
+                <w:sz w:val="24"/>
               </w:rPr>
               <w:t>Bùi Đặng Quốc Khánh</w:t>
             </w:r>
@@ -814,7 +842,7 @@
                 <w:rFonts w:ascii="Times New Roman" w:hAnsi="Times New Roman"/>
                 <w:b w:val="0"/>
                 <w:i w:val="0"/>
-                <w:sz w:val="18"/>
+                <w:sz w:val="24"/>
               </w:rPr>
               <w:t>123001005</w:t>
             </w:r>
@@ -840,7 +868,7 @@
                 <w:rFonts w:ascii="Times New Roman" w:hAnsi="Times New Roman"/>
                 <w:b w:val="0"/>
                 <w:i w:val="0"/>
-                <w:sz w:val="18"/>
+                <w:sz w:val="24"/>
               </w:rPr>
               <w:t>Thành viên</w:t>
             </w:r>
@@ -866,7 +894,7 @@
                 <w:rFonts w:ascii="Times New Roman" w:hAnsi="Times New Roman"/>
                 <w:b w:val="0"/>
                 <w:i w:val="0"/>
-                <w:sz w:val="18"/>
+                <w:sz w:val="24"/>
               </w:rPr>
               <w:t>PLEDGE &amp; CERT (TR-019 -&gt; TR-027)</w:t>
             </w:r>
@@ -892,7 +920,7 @@
                 <w:rFonts w:ascii="Times New Roman" w:hAnsi="Times New Roman"/>
                 <w:b w:val="0"/>
                 <w:i w:val="0"/>
-                <w:sz w:val="18"/>
+                <w:sz w:val="24"/>
               </w:rPr>
               <w:t>9 TR &amp; 20 TC</w:t>
             </w:r>
@@ -918,7 +946,7 @@
                 <w:rFonts w:ascii="Times New Roman" w:hAnsi="Times New Roman"/>
                 <w:b w:val="0"/>
                 <w:i w:val="0"/>
-                <w:sz w:val="18"/>
+                <w:sz w:val="24"/>
               </w:rPr>
               <w:t>Review cho Nguyễn Trung Tiến</w:t>
             </w:r>
@@ -935,18 +963,12 @@
             </w:tcMar>
           </w:tcPr>
           <w:p>
-            <w:pPr>
-              <w:spacing w:after="40" w:line="276" w:lineRule="auto"/>
-              <w:jc w:val="center"/>
-            </w:pPr>
             <w:r>
               <w:rPr>
                 <w:rFonts w:ascii="Times New Roman" w:hAnsi="Times New Roman"/>
-                <w:b w:val="0"/>
-                <w:i w:val="0"/>
-                <w:sz w:val="18"/>
+                <w:sz w:val="24"/>
               </w:rPr>
-              <w:t>15/20 TC đã chạy</w:t>
+              <w:t>17/20 TC đã chạy</w:t>
             </w:r>
           </w:p>
         </w:tc>
@@ -975,7 +997,7 @@
                 <w:rFonts w:ascii="Times New Roman" w:hAnsi="Times New Roman"/>
                 <w:b w:val="0"/>
                 <w:i w:val="0"/>
-                <w:sz w:val="18"/>
+                <w:sz w:val="24"/>
               </w:rPr>
               <w:t>4</w:t>
             </w:r>
@@ -1001,7 +1023,7 @@
                 <w:rFonts w:ascii="Times New Roman" w:hAnsi="Times New Roman"/>
                 <w:b w:val="0"/>
                 <w:i w:val="0"/>
-                <w:sz w:val="18"/>
+                <w:sz w:val="24"/>
               </w:rPr>
               <w:t>Nguyễn Trung Tiến</w:t>
             </w:r>
@@ -1027,7 +1049,7 @@
                 <w:rFonts w:ascii="Times New Roman" w:hAnsi="Times New Roman"/>
                 <w:b w:val="0"/>
                 <w:i w:val="0"/>
-                <w:sz w:val="18"/>
+                <w:sz w:val="24"/>
               </w:rPr>
               <w:t>123000127</w:t>
             </w:r>
@@ -1053,7 +1075,7 @@
                 <w:rFonts w:ascii="Times New Roman" w:hAnsi="Times New Roman"/>
                 <w:b w:val="0"/>
                 <w:i w:val="0"/>
-                <w:sz w:val="18"/>
+                <w:sz w:val="24"/>
               </w:rPr>
               <w:t>Thành viên</w:t>
             </w:r>
@@ -1079,7 +1101,7 @@
                 <w:rFonts w:ascii="Times New Roman" w:hAnsi="Times New Roman"/>
                 <w:b w:val="0"/>
                 <w:i w:val="0"/>
-                <w:sz w:val="18"/>
+                <w:sz w:val="24"/>
               </w:rPr>
               <w:t>COMM &amp; BLOG (TR-028 -&gt; TR-035)</w:t>
             </w:r>
@@ -1105,7 +1127,7 @@
                 <w:rFonts w:ascii="Times New Roman" w:hAnsi="Times New Roman"/>
                 <w:b w:val="0"/>
                 <w:i w:val="0"/>
-                <w:sz w:val="18"/>
+                <w:sz w:val="24"/>
               </w:rPr>
               <w:t>8 TR &amp; 23 TC</w:t>
             </w:r>
@@ -1131,7 +1153,7 @@
                 <w:rFonts w:ascii="Times New Roman" w:hAnsi="Times New Roman"/>
                 <w:b w:val="0"/>
                 <w:i w:val="0"/>
-                <w:sz w:val="18"/>
+                <w:sz w:val="24"/>
               </w:rPr>
               <w:t>Review cho Nguyễn Khánh Du</w:t>
             </w:r>
@@ -1157,7 +1179,7 @@
                 <w:rFonts w:ascii="Times New Roman" w:hAnsi="Times New Roman"/>
                 <w:b w:val="0"/>
                 <w:i w:val="0"/>
-                <w:sz w:val="18"/>
+                <w:sz w:val="24"/>
               </w:rPr>
               <w:t>21/23 TC đã chạy</w:t>
             </w:r>
@@ -1188,7 +1210,7 @@
                 <w:rFonts w:ascii="Times New Roman" w:hAnsi="Times New Roman"/>
                 <w:b w:val="0"/>
                 <w:i w:val="0"/>
-                <w:sz w:val="18"/>
+                <w:sz w:val="24"/>
               </w:rPr>
               <w:t>5</w:t>
             </w:r>
@@ -1214,7 +1236,7 @@
                 <w:rFonts w:ascii="Times New Roman" w:hAnsi="Times New Roman"/>
                 <w:b w:val="0"/>
                 <w:i w:val="0"/>
-                <w:sz w:val="18"/>
+                <w:sz w:val="24"/>
               </w:rPr>
               <w:t>Nguyễn Khánh Du</w:t>
             </w:r>
@@ -1240,7 +1262,7 @@
                 <w:rFonts w:ascii="Times New Roman" w:hAnsi="Times New Roman"/>
                 <w:b w:val="0"/>
                 <w:i w:val="0"/>
-                <w:sz w:val="18"/>
+                <w:sz w:val="24"/>
               </w:rPr>
               <w:t>123000159</w:t>
             </w:r>
@@ -1266,7 +1288,7 @@
                 <w:rFonts w:ascii="Times New Roman" w:hAnsi="Times New Roman"/>
                 <w:b w:val="0"/>
                 <w:i w:val="0"/>
-                <w:sz w:val="18"/>
+                <w:sz w:val="24"/>
               </w:rPr>
               <w:t>Thành viên</w:t>
             </w:r>
@@ -1292,7 +1314,7 @@
                 <w:rFonts w:ascii="Times New Roman" w:hAnsi="Times New Roman"/>
                 <w:b w:val="0"/>
                 <w:i w:val="0"/>
-                <w:sz w:val="18"/>
+                <w:sz w:val="24"/>
               </w:rPr>
               <w:t>CHAT &amp; ADMIN (TR-036 -&gt; TR-042)</w:t>
             </w:r>
@@ -1318,7 +1340,7 @@
                 <w:rFonts w:ascii="Times New Roman" w:hAnsi="Times New Roman"/>
                 <w:b w:val="0"/>
                 <w:i w:val="0"/>
-                <w:sz w:val="18"/>
+                <w:sz w:val="24"/>
               </w:rPr>
               <w:t>7 TR &amp; 15 TC</w:t>
             </w:r>
@@ -1344,7 +1366,7 @@
                 <w:rFonts w:ascii="Times New Roman" w:hAnsi="Times New Roman"/>
                 <w:b w:val="0"/>
                 <w:i w:val="0"/>
-                <w:sz w:val="18"/>
+                <w:sz w:val="24"/>
               </w:rPr>
               <w:t>Review cho Nguyễn Quách Phú Tài</w:t>
             </w:r>
@@ -1370,7 +1392,7 @@
                 <w:rFonts w:ascii="Times New Roman" w:hAnsi="Times New Roman"/>
                 <w:b w:val="0"/>
                 <w:i w:val="0"/>
-                <w:sz w:val="18"/>
+                <w:sz w:val="24"/>
               </w:rPr>
               <w:t>13/15 TC đã chạy</w:t>
             </w:r>
@@ -1378,10 +1400,18 @@
         </w:tc>
       </w:tr>
     </w:tbl>
-    <w:p/>
     <w:p>
+      <w:pPr>
+        <w:spacing w:line="288" w:lineRule="auto"/>
+      </w:pPr>
+    </w:p>
+    <w:p>
+      <w:pPr>
+        <w:spacing w:line="288" w:lineRule="auto"/>
+      </w:pPr>
       <w:r>
         <w:rPr>
+          <w:rFonts w:ascii="Times New Roman" w:hAnsi="Times New Roman"/>
           <w:b/>
           <w:color w:val="1F4E78"/>
           <w:sz w:val="24"/>
@@ -1390,41 +1420,65 @@
       </w:r>
     </w:p>
     <w:p>
+      <w:pPr>
+        <w:spacing w:line="288" w:lineRule="auto"/>
+      </w:pPr>
       <w:r>
         <w:rPr>
-          <w:sz w:val="22"/>
+          <w:rFonts w:ascii="Times New Roman" w:hAnsi="Times New Roman"/>
+          <w:sz w:val="24"/>
         </w:rPr>
         <w:t>• Tổng số Yêu cầu kiểm thử (TR): 42 TRs được suy luận trực tiếp từ mã nguồn và bao phủ trọn vẹn 10 phân hệ nghiệp vụ của nền tảng.</w:t>
       </w:r>
     </w:p>
     <w:p>
+      <w:pPr>
+        <w:spacing w:line="288" w:lineRule="auto"/>
+      </w:pPr>
       <w:r>
         <w:rPr>
-          <w:sz w:val="22"/>
+          <w:rFonts w:ascii="Times New Roman" w:hAnsi="Times New Roman"/>
+          <w:sz w:val="24"/>
         </w:rPr>
         <w:t>• Tổng số Kịch bản kiểm thử (TC): 105 TCs (phân bổ: 56 High, 36 Medium, 13 Low) được thiết kế theo đúng 4 kỹ thuật Functional, Boundary, Negative, LooknFeel.</w:t>
       </w:r>
     </w:p>
     <w:p>
+      <w:pPr>
+        <w:spacing w:line="288" w:lineRule="auto"/>
+      </w:pPr>
       <w:r>
         <w:rPr>
-          <w:sz w:val="22"/>
+          <w:rFonts w:ascii="Times New Roman" w:hAnsi="Times New Roman"/>
+          <w:sz w:val="24"/>
         </w:rPr>
         <w:t>• Kết quả thực thi thực tế: 89 PASS (95.7%), 4 FAIL (4.3%), 0 BLOCKED trên tổng số 93 TCs đã thực thi thành công; đạt chỉ tiêu chất lượng đề ra (≥ 85.0% PASS trên các TC đã thực thi).</w:t>
       </w:r>
     </w:p>
     <w:p>
+      <w:pPr>
+        <w:spacing w:line="288" w:lineRule="auto"/>
+      </w:pPr>
       <w:r>
         <w:rPr>
-          <w:sz w:val="22"/>
+          <w:rFonts w:ascii="Times New Roman" w:hAnsi="Times New Roman"/>
+          <w:sz w:val="24"/>
         </w:rPr>
         <w:t>• Số TC chưa thực thi: 12 TCs được để trống kết quả minh bạch kèm lý do kỹ thuật (yêu cầu quét thẻ thanh toán ngân hàng thực tế, cổng SMS OTP ngoài đời, chữ ký số token CA kết nối Thuế, camera eKYC vật lý và kiểm thử chịu tải phân tán 500 CCU).</w:t>
       </w:r>
     </w:p>
-    <w:p/>
     <w:p>
+      <w:pPr>
+        <w:spacing w:line="288" w:lineRule="auto"/>
+      </w:pPr>
+    </w:p>
+    <w:p>
+      <w:pPr>
+        <w:spacing w:line="288" w:lineRule="auto"/>
+      </w:pPr>
       <w:r>
         <w:rPr>
+          <w:rFonts w:ascii="Times New Roman" w:hAnsi="Times New Roman"/>
           <w:b/>
           <w:color w:val="1F4E78"/>
           <w:sz w:val="24"/>
@@ -1435,8 +1489,8 @@
     <w:tbl>
       <w:tblPr>
         <w:tblW w:type="auto" w:w="0"/>
+        <w:tblLook w:firstColumn="1" w:firstRow="1" w:lastColumn="0" w:lastRow="0" w:noHBand="0" w:noVBand="1" w:val="04A0"/>
         <w:jc w:val="center"/>
-        <w:tblLook w:firstColumn="1" w:firstRow="1" w:lastColumn="0" w:lastRow="0" w:noHBand="0" w:noVBand="1" w:val="04A0"/>
         <w:tblBorders>
           <w:top w:val="single" w:sz="4" w:space="0" w:color="D3D3D3"/>
           <w:left w:val="single" w:sz="4" w:space="0" w:color="D3D3D3"/>
@@ -1482,7 +1536,7 @@
                 <w:b/>
                 <w:i w:val="0"/>
                 <w:color w:val="FFFFFF"/>
-                <w:sz w:val="18"/>
+                <w:sz w:val="24"/>
               </w:rPr>
               <w:t>Mã Bug</w:t>
             </w:r>
@@ -1510,7 +1564,7 @@
                 <w:b/>
                 <w:i w:val="0"/>
                 <w:color w:val="FFFFFF"/>
-                <w:sz w:val="18"/>
+                <w:sz w:val="24"/>
               </w:rPr>
               <w:t>Phân hệ</w:t>
             </w:r>
@@ -1538,7 +1592,7 @@
                 <w:b/>
                 <w:i w:val="0"/>
                 <w:color w:val="FFFFFF"/>
-                <w:sz w:val="18"/>
+                <w:sz w:val="24"/>
               </w:rPr>
               <w:t>Tiêu đề lỗi phát hiện</w:t>
             </w:r>
@@ -1566,7 +1620,7 @@
                 <w:b/>
                 <w:i w:val="0"/>
                 <w:color w:val="FFFFFF"/>
-                <w:sz w:val="18"/>
+                <w:sz w:val="24"/>
               </w:rPr>
               <w:t>Mức độ</w:t>
             </w:r>
@@ -1594,7 +1648,7 @@
                 <w:b/>
                 <w:i w:val="0"/>
                 <w:color w:val="FFFFFF"/>
-                <w:sz w:val="18"/>
+                <w:sz w:val="24"/>
               </w:rPr>
               <w:t>File/route gây lỗi</w:t>
             </w:r>
@@ -1622,7 +1676,7 @@
                 <w:b/>
                 <w:i w:val="0"/>
                 <w:color w:val="FFFFFF"/>
-                <w:sz w:val="18"/>
+                <w:sz w:val="24"/>
               </w:rPr>
               <w:t>Dữ liệu tái hiện</w:t>
             </w:r>
@@ -1650,7 +1704,7 @@
                 <w:b/>
                 <w:i w:val="0"/>
                 <w:color w:val="FFFFFF"/>
-                <w:sz w:val="18"/>
+                <w:sz w:val="24"/>
               </w:rPr>
               <w:t>Hướng xử lý đề xuất</w:t>
             </w:r>
@@ -1681,7 +1735,7 @@
                 <w:rFonts w:ascii="Times New Roman" w:hAnsi="Times New Roman"/>
                 <w:b w:val="0"/>
                 <w:i w:val="0"/>
-                <w:sz w:val="17"/>
+                <w:sz w:val="24"/>
               </w:rPr>
               <w:t>BUG-001</w:t>
             </w:r>
@@ -1707,7 +1761,7 @@
                 <w:rFonts w:ascii="Times New Roman" w:hAnsi="Times New Roman"/>
                 <w:b w:val="0"/>
                 <w:i w:val="0"/>
-                <w:sz w:val="17"/>
+                <w:sz w:val="24"/>
               </w:rPr>
               <w:t>PLEDGE</w:t>
             </w:r>
@@ -1733,7 +1787,7 @@
                 <w:rFonts w:ascii="Times New Roman" w:hAnsi="Times New Roman"/>
                 <w:b w:val="0"/>
                 <w:i w:val="0"/>
-                <w:sz w:val="17"/>
+                <w:sz w:val="24"/>
               </w:rPr>
               <w:t>Cổng MoMo trả HTTP 410 ESCROW_BANK_ONLY do tắt thanh toán ví điện tử</w:t>
             </w:r>
@@ -1759,7 +1813,7 @@
                 <w:rFonts w:ascii="Times New Roman" w:hAnsi="Times New Roman"/>
                 <w:b w:val="0"/>
                 <w:i w:val="0"/>
-                <w:sz w:val="17"/>
+                <w:sz w:val="24"/>
               </w:rPr>
               <w:t>High</w:t>
             </w:r>
@@ -1785,7 +1839,7 @@
                 <w:rFonts w:ascii="Times New Roman" w:hAnsi="Times New Roman"/>
                 <w:b w:val="0"/>
                 <w:i w:val="0"/>
-                <w:sz w:val="17"/>
+                <w:sz w:val="24"/>
               </w:rPr>
               <w:t>src/app/api/payment/momo/create/route.ts</w:t>
             </w:r>
@@ -1811,7 +1865,7 @@
                 <w:rFonts w:ascii="Times New Roman" w:hAnsi="Times New Roman"/>
                 <w:b w:val="0"/>
                 <w:i w:val="0"/>
-                <w:sz w:val="17"/>
+                <w:sz w:val="24"/>
               </w:rPr>
               <w:t>POST /api/payment/momo/create -&gt; HTTP 410</w:t>
             </w:r>
@@ -1837,7 +1891,7 @@
                 <w:rFonts w:ascii="Times New Roman" w:hAnsi="Times New Roman"/>
                 <w:b w:val="0"/>
                 <w:i w:val="0"/>
-                <w:sz w:val="17"/>
+                <w:sz w:val="24"/>
               </w:rPr>
               <w:t>Tích hợp cổng MoMo chính thức hoặc ẩn nút ví điện tử trên UI</w:t>
             </w:r>
@@ -1868,7 +1922,7 @@
                 <w:rFonts w:ascii="Times New Roman" w:hAnsi="Times New Roman"/>
                 <w:b w:val="0"/>
                 <w:i w:val="0"/>
-                <w:sz w:val="17"/>
+                <w:sz w:val="24"/>
               </w:rPr>
               <w:t>BUG-002</w:t>
             </w:r>
@@ -1894,7 +1948,7 @@
                 <w:rFonts w:ascii="Times New Roman" w:hAnsi="Times New Roman"/>
                 <w:b w:val="0"/>
                 <w:i w:val="0"/>
-                <w:sz w:val="17"/>
+                <w:sz w:val="24"/>
               </w:rPr>
               <w:t>PLEDGE</w:t>
             </w:r>
@@ -1920,7 +1974,7 @@
                 <w:rFonts w:ascii="Times New Roman" w:hAnsi="Times New Roman"/>
                 <w:b w:val="0"/>
                 <w:i w:val="0"/>
-                <w:sz w:val="17"/>
+                <w:sz w:val="24"/>
               </w:rPr>
               <w:t>Cổng VNPay trả HTTP 410 ESCROW_BANK_ONLY do đóng cổng trung gian</w:t>
             </w:r>
@@ -1946,7 +2000,7 @@
                 <w:rFonts w:ascii="Times New Roman" w:hAnsi="Times New Roman"/>
                 <w:b w:val="0"/>
                 <w:i w:val="0"/>
-                <w:sz w:val="17"/>
+                <w:sz w:val="24"/>
               </w:rPr>
               <w:t>High</w:t>
             </w:r>
@@ -1972,7 +2026,7 @@
                 <w:rFonts w:ascii="Times New Roman" w:hAnsi="Times New Roman"/>
                 <w:b w:val="0"/>
                 <w:i w:val="0"/>
-                <w:sz w:val="17"/>
+                <w:sz w:val="24"/>
               </w:rPr>
               <w:t>src/app/api/payment/vnpay/create/route.ts</w:t>
             </w:r>
@@ -1998,7 +2052,7 @@
                 <w:rFonts w:ascii="Times New Roman" w:hAnsi="Times New Roman"/>
                 <w:b w:val="0"/>
                 <w:i w:val="0"/>
-                <w:sz w:val="17"/>
+                <w:sz w:val="24"/>
               </w:rPr>
               <w:t>POST /api/payment/vnpay/create -&gt; HTTP 410</w:t>
             </w:r>
@@ -2024,7 +2078,7 @@
                 <w:rFonts w:ascii="Times New Roman" w:hAnsi="Times New Roman"/>
                 <w:b w:val="0"/>
                 <w:i w:val="0"/>
-                <w:sz w:val="17"/>
+                <w:sz w:val="24"/>
               </w:rPr>
               <w:t>Đấu nối sandbox VNPay hoặc thông báo rõ chỉ nhận chuyển khoản VietQR</w:t>
             </w:r>
@@ -2055,7 +2109,7 @@
                 <w:rFonts w:ascii="Times New Roman" w:hAnsi="Times New Roman"/>
                 <w:b w:val="0"/>
                 <w:i w:val="0"/>
-                <w:sz w:val="17"/>
+                <w:sz w:val="24"/>
               </w:rPr>
               <w:t>BUG-003</w:t>
             </w:r>
@@ -2081,7 +2135,7 @@
                 <w:rFonts w:ascii="Times New Roman" w:hAnsi="Times New Roman"/>
                 <w:b w:val="0"/>
                 <w:i w:val="0"/>
-                <w:sz w:val="17"/>
+                <w:sz w:val="24"/>
               </w:rPr>
               <w:t>CHAT</w:t>
             </w:r>
@@ -2107,7 +2161,7 @@
                 <w:rFonts w:ascii="Times New Roman" w:hAnsi="Times New Roman"/>
                 <w:b w:val="0"/>
                 <w:i w:val="0"/>
-                <w:sz w:val="17"/>
+                <w:sz w:val="24"/>
               </w:rPr>
               <w:t>Cơ chế truyền tín hiệu cuộc gọi P2P dùng Polling 1.2s thay vì WebSocket</w:t>
             </w:r>
@@ -2133,7 +2187,7 @@
                 <w:rFonts w:ascii="Times New Roman" w:hAnsi="Times New Roman"/>
                 <w:b w:val="0"/>
                 <w:i w:val="0"/>
-                <w:sz w:val="17"/>
+                <w:sz w:val="24"/>
               </w:rPr>
               <w:t>Medium</w:t>
             </w:r>
@@ -2159,7 +2213,7 @@
                 <w:rFonts w:ascii="Times New Roman" w:hAnsi="Times New Roman"/>
                 <w:b w:val="0"/>
                 <w:i w:val="0"/>
-                <w:sz w:val="17"/>
+                <w:sz w:val="24"/>
               </w:rPr>
               <w:t>src/hooks/useCall.ts:33 (POLL_MS = 1200)</w:t>
             </w:r>
@@ -2185,7 +2239,7 @@
                 <w:rFonts w:ascii="Times New Roman" w:hAnsi="Times New Roman"/>
                 <w:b w:val="0"/>
                 <w:i w:val="0"/>
-                <w:sz w:val="17"/>
+                <w:sz w:val="24"/>
               </w:rPr>
               <w:t>Mở cuộc gọi P2P -&gt; liên tục gửi request polling</w:t>
             </w:r>
@@ -2211,7 +2265,7 @@
                 <w:rFonts w:ascii="Times New Roman" w:hAnsi="Times New Roman"/>
                 <w:b w:val="0"/>
                 <w:i w:val="0"/>
-                <w:sz w:val="17"/>
+                <w:sz w:val="24"/>
               </w:rPr>
               <w:t>Nâng cấp hạ tầng WebSocket / Socket.io để giảm độ trễ và tải server</w:t>
             </w:r>
@@ -2242,7 +2296,7 @@
                 <w:rFonts w:ascii="Times New Roman" w:hAnsi="Times New Roman"/>
                 <w:b w:val="0"/>
                 <w:i w:val="0"/>
-                <w:sz w:val="17"/>
+                <w:sz w:val="24"/>
               </w:rPr>
               <w:t>BUG-004</w:t>
             </w:r>
@@ -2268,7 +2322,7 @@
                 <w:rFonts w:ascii="Times New Roman" w:hAnsi="Times New Roman"/>
                 <w:b w:val="0"/>
                 <w:i w:val="0"/>
-                <w:sz w:val="17"/>
+                <w:sz w:val="24"/>
               </w:rPr>
               <w:t>COMM</w:t>
             </w:r>
@@ -2294,7 +2348,7 @@
                 <w:rFonts w:ascii="Times New Roman" w:hAnsi="Times New Roman"/>
                 <w:b w:val="0"/>
                 <w:i w:val="0"/>
-                <w:sz w:val="17"/>
+                <w:sz w:val="24"/>
               </w:rPr>
               <w:t>Giao diện góp ý thiếu validate trực tiếp, submit &lt; 10 ký tự nhận lỗi 400</w:t>
             </w:r>
@@ -2320,7 +2374,7 @@
                 <w:rFonts w:ascii="Times New Roman" w:hAnsi="Times New Roman"/>
                 <w:b w:val="0"/>
                 <w:i w:val="0"/>
-                <w:sz w:val="17"/>
+                <w:sz w:val="24"/>
               </w:rPr>
               <w:t>Low</w:t>
             </w:r>
@@ -2346,7 +2400,7 @@
                 <w:rFonts w:ascii="Times New Roman" w:hAnsi="Times New Roman"/>
                 <w:b w:val="0"/>
                 <w:i w:val="0"/>
-                <w:sz w:val="17"/>
+                <w:sz w:val="24"/>
               </w:rPr>
               <w:t>src/app/api/feedback/route.ts:16</w:t>
             </w:r>
@@ -2372,7 +2426,7 @@
                 <w:rFonts w:ascii="Times New Roman" w:hAnsi="Times New Roman"/>
                 <w:b w:val="0"/>
                 <w:i w:val="0"/>
-                <w:sz w:val="17"/>
+                <w:sz w:val="24"/>
               </w:rPr>
               <w:t>Nhập 'Lỗi nè' (7 ký tự) -&gt; HTTP 400 từ server</w:t>
             </w:r>
@@ -2398,7 +2452,7 @@
                 <w:rFonts w:ascii="Times New Roman" w:hAnsi="Times New Roman"/>
                 <w:b w:val="0"/>
                 <w:i w:val="0"/>
-                <w:sz w:val="17"/>
+                <w:sz w:val="24"/>
               </w:rPr>
               <w:t>Thêm bộ đếm ký tự và validate trực tiếp trên client trước khi gửi API</w:t>
             </w:r>
@@ -2406,10 +2460,18 @@
         </w:tc>
       </w:tr>
     </w:tbl>
-    <w:p/>
     <w:p>
+      <w:pPr>
+        <w:spacing w:line="288" w:lineRule="auto"/>
+      </w:pPr>
+    </w:p>
+    <w:p>
+      <w:pPr>
+        <w:spacing w:line="288" w:lineRule="auto"/>
+      </w:pPr>
       <w:r>
         <w:rPr>
+          <w:rFonts w:ascii="Times New Roman" w:hAnsi="Times New Roman"/>
           <w:b/>
           <w:color w:val="1F4E78"/>
           <w:sz w:val="24"/>
@@ -2420,8 +2482,8 @@
     <w:tbl>
       <w:tblPr>
         <w:tblW w:type="auto" w:w="0"/>
+        <w:tblLook w:firstColumn="1" w:firstRow="1" w:lastColumn="0" w:lastRow="0" w:noHBand="0" w:noVBand="1" w:val="04A0"/>
         <w:jc w:val="center"/>
-        <w:tblLook w:firstColumn="1" w:firstRow="1" w:lastColumn="0" w:lastRow="0" w:noHBand="0" w:noVBand="1" w:val="04A0"/>
         <w:tblBorders>
           <w:top w:val="single" w:sz="4" w:space="0" w:color="D3D3D3"/>
           <w:left w:val="single" w:sz="4" w:space="0" w:color="D3D3D3"/>
@@ -2468,7 +2530,7 @@
                 <w:b/>
                 <w:i w:val="0"/>
                 <w:color w:val="FFFFFF"/>
-                <w:sz w:val="18"/>
+                <w:sz w:val="24"/>
               </w:rPr>
               <w:t>Phân hệ</w:t>
             </w:r>
@@ -2496,7 +2558,7 @@
                 <w:b/>
                 <w:i w:val="0"/>
                 <w:color w:val="FFFFFF"/>
-                <w:sz w:val="18"/>
+                <w:sz w:val="24"/>
               </w:rPr>
               <w:t>Route/API chính</w:t>
             </w:r>
@@ -2524,7 +2586,7 @@
                 <w:b/>
                 <w:i w:val="0"/>
                 <w:color w:val="FFFFFF"/>
-                <w:sz w:val="18"/>
+                <w:sz w:val="24"/>
               </w:rPr>
               <w:t>Model Prisma</w:t>
             </w:r>
@@ -2552,7 +2614,7 @@
                 <w:b/>
                 <w:i w:val="0"/>
                 <w:color w:val="FFFFFF"/>
-                <w:sz w:val="18"/>
+                <w:sz w:val="24"/>
               </w:rPr>
               <w:t>TR</w:t>
             </w:r>
@@ -2580,7 +2642,7 @@
                 <w:b/>
                 <w:i w:val="0"/>
                 <w:color w:val="FFFFFF"/>
-                <w:sz w:val="18"/>
+                <w:sz w:val="24"/>
               </w:rPr>
               <w:t>TC</w:t>
             </w:r>
@@ -2608,7 +2670,7 @@
                 <w:b/>
                 <w:i w:val="0"/>
                 <w:color w:val="FFFFFF"/>
-                <w:sz w:val="18"/>
+                <w:sz w:val="24"/>
               </w:rPr>
               <w:t>Đã chạy</w:t>
             </w:r>
@@ -2636,7 +2698,7 @@
                 <w:b/>
                 <w:i w:val="0"/>
                 <w:color w:val="FFFFFF"/>
-                <w:sz w:val="18"/>
+                <w:sz w:val="24"/>
               </w:rPr>
               <w:t>PASS/FAIL/BLOCKED</w:t>
             </w:r>
@@ -2664,7 +2726,7 @@
                 <w:b/>
                 <w:i w:val="0"/>
                 <w:color w:val="FFFFFF"/>
-                <w:sz w:val="18"/>
+                <w:sz w:val="24"/>
               </w:rPr>
               <w:t>Chưa chạy</w:t>
             </w:r>
@@ -2695,7 +2757,7 @@
                 <w:rFonts w:ascii="Times New Roman" w:hAnsi="Times New Roman"/>
                 <w:b w:val="0"/>
                 <w:i w:val="0"/>
-                <w:sz w:val="17"/>
+                <w:sz w:val="24"/>
               </w:rPr>
               <w:t>AUTH</w:t>
             </w:r>
@@ -2721,7 +2783,7 @@
                 <w:rFonts w:ascii="Times New Roman" w:hAnsi="Times New Roman"/>
                 <w:b w:val="0"/>
                 <w:i w:val="0"/>
-                <w:sz w:val="17"/>
+                <w:sz w:val="24"/>
               </w:rPr>
               <w:t>/auth/*, /api/auth/*</w:t>
             </w:r>
@@ -2747,7 +2809,7 @@
                 <w:rFonts w:ascii="Times New Roman" w:hAnsi="Times New Roman"/>
                 <w:b w:val="0"/>
                 <w:i w:val="0"/>
-                <w:sz w:val="17"/>
+                <w:sz w:val="24"/>
               </w:rPr>
               <w:t>users, password_reset_tokens</w:t>
             </w:r>
@@ -2773,7 +2835,7 @@
                 <w:rFonts w:ascii="Times New Roman" w:hAnsi="Times New Roman"/>
                 <w:b w:val="0"/>
                 <w:i w:val="0"/>
-                <w:sz w:val="17"/>
+                <w:sz w:val="24"/>
               </w:rPr>
               <w:t>5</w:t>
             </w:r>
@@ -2799,7 +2861,7 @@
                 <w:rFonts w:ascii="Times New Roman" w:hAnsi="Times New Roman"/>
                 <w:b w:val="0"/>
                 <w:i w:val="0"/>
-                <w:sz w:val="17"/>
+                <w:sz w:val="24"/>
               </w:rPr>
               <w:t>12</w:t>
             </w:r>
@@ -2825,7 +2887,7 @@
                 <w:rFonts w:ascii="Times New Roman" w:hAnsi="Times New Roman"/>
                 <w:b w:val="0"/>
                 <w:i w:val="0"/>
-                <w:sz w:val="17"/>
+                <w:sz w:val="24"/>
               </w:rPr>
               <w:t>10</w:t>
             </w:r>
@@ -2851,7 +2913,7 @@
                 <w:rFonts w:ascii="Times New Roman" w:hAnsi="Times New Roman"/>
                 <w:b w:val="0"/>
                 <w:i w:val="0"/>
-                <w:sz w:val="17"/>
+                <w:sz w:val="24"/>
               </w:rPr>
               <w:t>10 / 0 / 0</w:t>
             </w:r>
@@ -2877,7 +2939,7 @@
                 <w:rFonts w:ascii="Times New Roman" w:hAnsi="Times New Roman"/>
                 <w:b w:val="0"/>
                 <w:i w:val="0"/>
-                <w:sz w:val="17"/>
+                <w:sz w:val="24"/>
               </w:rPr>
               <w:t>2</w:t>
             </w:r>
@@ -2908,7 +2970,7 @@
                 <w:rFonts w:ascii="Times New Roman" w:hAnsi="Times New Roman"/>
                 <w:b w:val="0"/>
                 <w:i w:val="0"/>
-                <w:sz w:val="17"/>
+                <w:sz w:val="24"/>
               </w:rPr>
               <w:t>KYC</w:t>
             </w:r>
@@ -2934,7 +2996,7 @@
                 <w:rFonts w:ascii="Times New Roman" w:hAnsi="Times New Roman"/>
                 <w:b w:val="0"/>
                 <w:i w:val="0"/>
-                <w:sz w:val="17"/>
+                <w:sz w:val="24"/>
               </w:rPr>
               <w:t>/kyc, /api/user/upgrade-creator, /admin/kyc</w:t>
             </w:r>
@@ -2960,7 +3022,7 @@
                 <w:rFonts w:ascii="Times New Roman" w:hAnsi="Times New Roman"/>
                 <w:b w:val="0"/>
                 <w:i w:val="0"/>
-                <w:sz w:val="17"/>
+                <w:sz w:val="24"/>
               </w:rPr>
               <w:t>kyc_info, users</w:t>
             </w:r>
@@ -2986,7 +3048,7 @@
                 <w:rFonts w:ascii="Times New Roman" w:hAnsi="Times New Roman"/>
                 <w:b w:val="0"/>
                 <w:i w:val="0"/>
-                <w:sz w:val="17"/>
+                <w:sz w:val="24"/>
               </w:rPr>
               <w:t>4</w:t>
             </w:r>
@@ -3012,7 +3074,7 @@
                 <w:rFonts w:ascii="Times New Roman" w:hAnsi="Times New Roman"/>
                 <w:b w:val="0"/>
                 <w:i w:val="0"/>
-                <w:sz w:val="17"/>
+                <w:sz w:val="24"/>
               </w:rPr>
               <w:t>11</w:t>
             </w:r>
@@ -3038,7 +3100,7 @@
                 <w:rFonts w:ascii="Times New Roman" w:hAnsi="Times New Roman"/>
                 <w:b w:val="0"/>
                 <w:i w:val="0"/>
-                <w:sz w:val="17"/>
+                <w:sz w:val="24"/>
               </w:rPr>
               <w:t>10</w:t>
             </w:r>
@@ -3064,7 +3126,7 @@
                 <w:rFonts w:ascii="Times New Roman" w:hAnsi="Times New Roman"/>
                 <w:b w:val="0"/>
                 <w:i w:val="0"/>
-                <w:sz w:val="17"/>
+                <w:sz w:val="24"/>
               </w:rPr>
               <w:t>10 / 0 / 0</w:t>
             </w:r>
@@ -3090,7 +3152,7 @@
                 <w:rFonts w:ascii="Times New Roman" w:hAnsi="Times New Roman"/>
                 <w:b w:val="0"/>
                 <w:i w:val="0"/>
-                <w:sz w:val="17"/>
+                <w:sz w:val="24"/>
               </w:rPr>
               <w:t>1</w:t>
             </w:r>
@@ -3121,7 +3183,7 @@
                 <w:rFonts w:ascii="Times New Roman" w:hAnsi="Times New Roman"/>
                 <w:b w:val="0"/>
                 <w:i w:val="0"/>
-                <w:sz w:val="17"/>
+                <w:sz w:val="24"/>
               </w:rPr>
               <w:t>CAMP</w:t>
             </w:r>
@@ -3147,7 +3209,7 @@
                 <w:rFonts w:ascii="Times New Roman" w:hAnsi="Times New Roman"/>
                 <w:b w:val="0"/>
                 <w:i w:val="0"/>
-                <w:sz w:val="17"/>
+                <w:sz w:val="24"/>
               </w:rPr>
               <w:t>/campaigns/*, /api/campaigns/*</w:t>
             </w:r>
@@ -3173,7 +3235,7 @@
                 <w:rFonts w:ascii="Times New Roman" w:hAnsi="Times New Roman"/>
                 <w:b w:val="0"/>
                 <w:i w:val="0"/>
-                <w:sz w:val="17"/>
+                <w:sz w:val="24"/>
               </w:rPr>
               <w:t>campaigns, campaign_updates</w:t>
             </w:r>
@@ -3199,7 +3261,7 @@
                 <w:rFonts w:ascii="Times New Roman" w:hAnsi="Times New Roman"/>
                 <w:b w:val="0"/>
                 <w:i w:val="0"/>
-                <w:sz w:val="17"/>
+                <w:sz w:val="24"/>
               </w:rPr>
               <w:t>5</w:t>
             </w:r>
@@ -3225,7 +3287,7 @@
                 <w:rFonts w:ascii="Times New Roman" w:hAnsi="Times New Roman"/>
                 <w:b w:val="0"/>
                 <w:i w:val="0"/>
-                <w:sz w:val="17"/>
+                <w:sz w:val="24"/>
               </w:rPr>
               <w:t>15</w:t>
             </w:r>
@@ -3251,7 +3313,7 @@
                 <w:rFonts w:ascii="Times New Roman" w:hAnsi="Times New Roman"/>
                 <w:b w:val="0"/>
                 <w:i w:val="0"/>
-                <w:sz w:val="17"/>
+                <w:sz w:val="24"/>
               </w:rPr>
               <w:t>14</w:t>
             </w:r>
@@ -3277,7 +3339,7 @@
                 <w:rFonts w:ascii="Times New Roman" w:hAnsi="Times New Roman"/>
                 <w:b w:val="0"/>
                 <w:i w:val="0"/>
-                <w:sz w:val="17"/>
+                <w:sz w:val="24"/>
               </w:rPr>
               <w:t>14 / 0 / 0</w:t>
             </w:r>
@@ -3303,7 +3365,7 @@
                 <w:rFonts w:ascii="Times New Roman" w:hAnsi="Times New Roman"/>
                 <w:b w:val="0"/>
                 <w:i w:val="0"/>
-                <w:sz w:val="17"/>
+                <w:sz w:val="24"/>
               </w:rPr>
               <w:t>1</w:t>
             </w:r>
@@ -3334,7 +3396,7 @@
                 <w:rFonts w:ascii="Times New Roman" w:hAnsi="Times New Roman"/>
                 <w:b w:val="0"/>
                 <w:i w:val="0"/>
-                <w:sz w:val="17"/>
+                <w:sz w:val="24"/>
               </w:rPr>
               <w:t>REWARD</w:t>
             </w:r>
@@ -3360,7 +3422,7 @@
                 <w:rFonts w:ascii="Times New Roman" w:hAnsi="Times New Roman"/>
                 <w:b w:val="0"/>
                 <w:i w:val="0"/>
-                <w:sz w:val="17"/>
+                <w:sz w:val="24"/>
               </w:rPr>
               <w:t>/rewards/*, /products/*</w:t>
             </w:r>
@@ -3386,7 +3448,7 @@
                 <w:rFonts w:ascii="Times New Roman" w:hAnsi="Times New Roman"/>
                 <w:b w:val="0"/>
                 <w:i w:val="0"/>
-                <w:sz w:val="17"/>
+                <w:sz w:val="24"/>
               </w:rPr>
               <w:t>rewards, reward_digital_assets</w:t>
             </w:r>
@@ -3412,7 +3474,7 @@
                 <w:rFonts w:ascii="Times New Roman" w:hAnsi="Times New Roman"/>
                 <w:b w:val="0"/>
                 <w:i w:val="0"/>
-                <w:sz w:val="17"/>
+                <w:sz w:val="24"/>
               </w:rPr>
               <w:t>4</w:t>
             </w:r>
@@ -3438,7 +3500,7 @@
                 <w:rFonts w:ascii="Times New Roman" w:hAnsi="Times New Roman"/>
                 <w:b w:val="0"/>
                 <w:i w:val="0"/>
-                <w:sz w:val="17"/>
+                <w:sz w:val="24"/>
               </w:rPr>
               <w:t>9</w:t>
             </w:r>
@@ -3464,7 +3526,7 @@
                 <w:rFonts w:ascii="Times New Roman" w:hAnsi="Times New Roman"/>
                 <w:b w:val="0"/>
                 <w:i w:val="0"/>
-                <w:sz w:val="17"/>
+                <w:sz w:val="24"/>
               </w:rPr>
               <w:t>8</w:t>
             </w:r>
@@ -3490,7 +3552,7 @@
                 <w:rFonts w:ascii="Times New Roman" w:hAnsi="Times New Roman"/>
                 <w:b w:val="0"/>
                 <w:i w:val="0"/>
-                <w:sz w:val="17"/>
+                <w:sz w:val="24"/>
               </w:rPr>
               <w:t>8 / 0 / 0</w:t>
             </w:r>
@@ -3516,7 +3578,7 @@
                 <w:rFonts w:ascii="Times New Roman" w:hAnsi="Times New Roman"/>
                 <w:b w:val="0"/>
                 <w:i w:val="0"/>
-                <w:sz w:val="17"/>
+                <w:sz w:val="24"/>
               </w:rPr>
               <w:t>1</w:t>
             </w:r>
@@ -3547,7 +3609,7 @@
                 <w:rFonts w:ascii="Times New Roman" w:hAnsi="Times New Roman"/>
                 <w:b w:val="0"/>
                 <w:i w:val="0"/>
-                <w:sz w:val="17"/>
+                <w:sz w:val="24"/>
               </w:rPr>
               <w:t>PLEDGE</w:t>
             </w:r>
@@ -3573,7 +3635,7 @@
                 <w:rFonts w:ascii="Times New Roman" w:hAnsi="Times New Roman"/>
                 <w:b w:val="0"/>
                 <w:i w:val="0"/>
-                <w:sz w:val="17"/>
+                <w:sz w:val="24"/>
               </w:rPr>
               <w:t>/thanh-toan/*, /api/payment/*</w:t>
             </w:r>
@@ -3599,7 +3661,7 @@
                 <w:rFonts w:ascii="Times New Roman" w:hAnsi="Times New Roman"/>
                 <w:b w:val="0"/>
                 <w:i w:val="0"/>
-                <w:sz w:val="17"/>
+                <w:sz w:val="24"/>
               </w:rPr>
               <w:t>pledges, donation_certificates</w:t>
             </w:r>
@@ -3625,7 +3687,7 @@
                 <w:rFonts w:ascii="Times New Roman" w:hAnsi="Times New Roman"/>
                 <w:b w:val="0"/>
                 <w:i w:val="0"/>
-                <w:sz w:val="17"/>
+                <w:sz w:val="24"/>
               </w:rPr>
               <w:t>5</w:t>
             </w:r>
@@ -3651,7 +3713,7 @@
                 <w:rFonts w:ascii="Times New Roman" w:hAnsi="Times New Roman"/>
                 <w:b w:val="0"/>
                 <w:i w:val="0"/>
-                <w:sz w:val="17"/>
+                <w:sz w:val="24"/>
               </w:rPr>
               <w:t>10</w:t>
             </w:r>
@@ -3677,7 +3739,7 @@
                 <w:rFonts w:ascii="Times New Roman" w:hAnsi="Times New Roman"/>
                 <w:b w:val="0"/>
                 <w:i w:val="0"/>
-                <w:sz w:val="17"/>
+                <w:sz w:val="24"/>
               </w:rPr>
               <w:t>8</w:t>
             </w:r>
@@ -3703,7 +3765,7 @@
                 <w:rFonts w:ascii="Times New Roman" w:hAnsi="Times New Roman"/>
                 <w:b w:val="0"/>
                 <w:i w:val="0"/>
-                <w:sz w:val="17"/>
+                <w:sz w:val="24"/>
               </w:rPr>
               <w:t>6 / 2 / 0</w:t>
             </w:r>
@@ -3729,7 +3791,7 @@
                 <w:rFonts w:ascii="Times New Roman" w:hAnsi="Times New Roman"/>
                 <w:b w:val="0"/>
                 <w:i w:val="0"/>
-                <w:sz w:val="17"/>
+                <w:sz w:val="24"/>
               </w:rPr>
               <w:t>2</w:t>
             </w:r>
@@ -3760,7 +3822,7 @@
                 <w:rFonts w:ascii="Times New Roman" w:hAnsi="Times New Roman"/>
                 <w:b w:val="0"/>
                 <w:i w:val="0"/>
-                <w:sz w:val="17"/>
+                <w:sz w:val="24"/>
               </w:rPr>
               <w:t>CERT</w:t>
             </w:r>
@@ -3786,7 +3848,7 @@
                 <w:rFonts w:ascii="Times New Roman" w:hAnsi="Times New Roman"/>
                 <w:b w:val="0"/>
                 <w:i w:val="0"/>
-                <w:sz w:val="17"/>
+                <w:sz w:val="24"/>
               </w:rPr>
               <w:t>/lookup, /chung-tu/*, /hoa-don/*, /so</w:t>
             </w:r>
@@ -3812,7 +3874,7 @@
                 <w:rFonts w:ascii="Times New Roman" w:hAnsi="Times New Roman"/>
                 <w:b w:val="0"/>
                 <w:i w:val="0"/>
-                <w:sz w:val="17"/>
+                <w:sz w:val="24"/>
               </w:rPr>
               <w:t>backer_invoices, so_ledgers</w:t>
             </w:r>
@@ -3838,7 +3900,7 @@
                 <w:rFonts w:ascii="Times New Roman" w:hAnsi="Times New Roman"/>
                 <w:b w:val="0"/>
                 <w:i w:val="0"/>
-                <w:sz w:val="17"/>
+                <w:sz w:val="24"/>
               </w:rPr>
               <w:t>4</w:t>
             </w:r>
@@ -3864,7 +3926,7 @@
                 <w:rFonts w:ascii="Times New Roman" w:hAnsi="Times New Roman"/>
                 <w:b w:val="0"/>
                 <w:i w:val="0"/>
-                <w:sz w:val="17"/>
+                <w:sz w:val="24"/>
               </w:rPr>
               <w:t>10</w:t>
             </w:r>
@@ -3890,7 +3952,7 @@
                 <w:rFonts w:ascii="Times New Roman" w:hAnsi="Times New Roman"/>
                 <w:b w:val="0"/>
                 <w:i w:val="0"/>
-                <w:sz w:val="17"/>
+                <w:sz w:val="24"/>
               </w:rPr>
               <w:t>9</w:t>
             </w:r>
@@ -3916,7 +3978,7 @@
                 <w:rFonts w:ascii="Times New Roman" w:hAnsi="Times New Roman"/>
                 <w:b w:val="0"/>
                 <w:i w:val="0"/>
-                <w:sz w:val="17"/>
+                <w:sz w:val="24"/>
               </w:rPr>
               <w:t>9 / 0 / 0</w:t>
             </w:r>
@@ -3942,7 +4004,7 @@
                 <w:rFonts w:ascii="Times New Roman" w:hAnsi="Times New Roman"/>
                 <w:b w:val="0"/>
                 <w:i w:val="0"/>
-                <w:sz w:val="17"/>
+                <w:sz w:val="24"/>
               </w:rPr>
               <w:t>1</w:t>
             </w:r>
@@ -3973,7 +4035,7 @@
                 <w:rFonts w:ascii="Times New Roman" w:hAnsi="Times New Roman"/>
                 <w:b w:val="0"/>
                 <w:i w:val="0"/>
-                <w:sz w:val="17"/>
+                <w:sz w:val="24"/>
               </w:rPr>
               <w:t>COMM</w:t>
             </w:r>
@@ -3999,7 +4061,7 @@
                 <w:rFonts w:ascii="Times New Roman" w:hAnsi="Times New Roman"/>
                 <w:b w:val="0"/>
                 <w:i w:val="0"/>
-                <w:sz w:val="17"/>
+                <w:sz w:val="24"/>
               </w:rPr>
               <w:t>/gop-y, /api/feedback, /api/reports</w:t>
             </w:r>
@@ -4025,7 +4087,7 @@
                 <w:rFonts w:ascii="Times New Roman" w:hAnsi="Times New Roman"/>
                 <w:b w:val="0"/>
                 <w:i w:val="0"/>
-                <w:sz w:val="17"/>
+                <w:sz w:val="24"/>
               </w:rPr>
               <w:t>platform_feedback, reviews</w:t>
             </w:r>
@@ -4051,7 +4113,7 @@
                 <w:rFonts w:ascii="Times New Roman" w:hAnsi="Times New Roman"/>
                 <w:b w:val="0"/>
                 <w:i w:val="0"/>
-                <w:sz w:val="17"/>
+                <w:sz w:val="24"/>
               </w:rPr>
               <w:t>4</w:t>
             </w:r>
@@ -4077,7 +4139,7 @@
                 <w:rFonts w:ascii="Times New Roman" w:hAnsi="Times New Roman"/>
                 <w:b w:val="0"/>
                 <w:i w:val="0"/>
-                <w:sz w:val="17"/>
+                <w:sz w:val="24"/>
               </w:rPr>
               <w:t>11</w:t>
             </w:r>
@@ -4103,7 +4165,7 @@
                 <w:rFonts w:ascii="Times New Roman" w:hAnsi="Times New Roman"/>
                 <w:b w:val="0"/>
                 <w:i w:val="0"/>
-                <w:sz w:val="17"/>
+                <w:sz w:val="24"/>
               </w:rPr>
               <w:t>10</w:t>
             </w:r>
@@ -4129,7 +4191,7 @@
                 <w:rFonts w:ascii="Times New Roman" w:hAnsi="Times New Roman"/>
                 <w:b w:val="0"/>
                 <w:i w:val="0"/>
-                <w:sz w:val="17"/>
+                <w:sz w:val="24"/>
               </w:rPr>
               <w:t>9 / 1 / 0</w:t>
             </w:r>
@@ -4155,7 +4217,7 @@
                 <w:rFonts w:ascii="Times New Roman" w:hAnsi="Times New Roman"/>
                 <w:b w:val="0"/>
                 <w:i w:val="0"/>
-                <w:sz w:val="17"/>
+                <w:sz w:val="24"/>
               </w:rPr>
               <w:t>1</w:t>
             </w:r>
@@ -4186,7 +4248,7 @@
                 <w:rFonts w:ascii="Times New Roman" w:hAnsi="Times New Roman"/>
                 <w:b w:val="0"/>
                 <w:i w:val="0"/>
-                <w:sz w:val="17"/>
+                <w:sz w:val="24"/>
               </w:rPr>
               <w:t>BLOG</w:t>
             </w:r>
@@ -4212,7 +4274,7 @@
                 <w:rFonts w:ascii="Times New Roman" w:hAnsi="Times New Roman"/>
                 <w:b w:val="0"/>
                 <w:i w:val="0"/>
-                <w:sz w:val="17"/>
+                <w:sz w:val="24"/>
               </w:rPr>
               <w:t>/blog/*, /api/blog/*</w:t>
             </w:r>
@@ -4238,7 +4300,7 @@
                 <w:rFonts w:ascii="Times New Roman" w:hAnsi="Times New Roman"/>
                 <w:b w:val="0"/>
                 <w:i w:val="0"/>
-                <w:sz w:val="17"/>
+                <w:sz w:val="24"/>
               </w:rPr>
               <w:t>blog_posts, blog_comments</w:t>
             </w:r>
@@ -4264,7 +4326,7 @@
                 <w:rFonts w:ascii="Times New Roman" w:hAnsi="Times New Roman"/>
                 <w:b w:val="0"/>
                 <w:i w:val="0"/>
-                <w:sz w:val="17"/>
+                <w:sz w:val="24"/>
               </w:rPr>
               <w:t>4</w:t>
             </w:r>
@@ -4290,7 +4352,7 @@
                 <w:rFonts w:ascii="Times New Roman" w:hAnsi="Times New Roman"/>
                 <w:b w:val="0"/>
                 <w:i w:val="0"/>
-                <w:sz w:val="17"/>
+                <w:sz w:val="24"/>
               </w:rPr>
               <w:t>12</w:t>
             </w:r>
@@ -4316,7 +4378,7 @@
                 <w:rFonts w:ascii="Times New Roman" w:hAnsi="Times New Roman"/>
                 <w:b w:val="0"/>
                 <w:i w:val="0"/>
-                <w:sz w:val="17"/>
+                <w:sz w:val="24"/>
               </w:rPr>
               <w:t>11</w:t>
             </w:r>
@@ -4342,7 +4404,7 @@
                 <w:rFonts w:ascii="Times New Roman" w:hAnsi="Times New Roman"/>
                 <w:b w:val="0"/>
                 <w:i w:val="0"/>
-                <w:sz w:val="17"/>
+                <w:sz w:val="24"/>
               </w:rPr>
               <w:t>11 / 0 / 0</w:t>
             </w:r>
@@ -4368,7 +4430,7 @@
                 <w:rFonts w:ascii="Times New Roman" w:hAnsi="Times New Roman"/>
                 <w:b w:val="0"/>
                 <w:i w:val="0"/>
-                <w:sz w:val="17"/>
+                <w:sz w:val="24"/>
               </w:rPr>
               <w:t>1</w:t>
             </w:r>
@@ -4399,7 +4461,7 @@
                 <w:rFonts w:ascii="Times New Roman" w:hAnsi="Times New Roman"/>
                 <w:b w:val="0"/>
                 <w:i w:val="0"/>
-                <w:sz w:val="17"/>
+                <w:sz w:val="24"/>
               </w:rPr>
               <w:t>CHAT</w:t>
             </w:r>
@@ -4425,7 +4487,7 @@
                 <w:rFonts w:ascii="Times New Roman" w:hAnsi="Times New Roman"/>
                 <w:b w:val="0"/>
                 <w:i w:val="0"/>
-                <w:sz w:val="17"/>
+                <w:sz w:val="24"/>
               </w:rPr>
               <w:t>/chat/*, src/hooks/useCall.ts</w:t>
             </w:r>
@@ -4451,7 +4513,7 @@
                 <w:rFonts w:ascii="Times New Roman" w:hAnsi="Times New Roman"/>
                 <w:b w:val="0"/>
                 <w:i w:val="0"/>
-                <w:sz w:val="17"/>
+                <w:sz w:val="24"/>
               </w:rPr>
               <w:t>conversations, messages</w:t>
             </w:r>
@@ -4477,7 +4539,7 @@
                 <w:rFonts w:ascii="Times New Roman" w:hAnsi="Times New Roman"/>
                 <w:b w:val="0"/>
                 <w:i w:val="0"/>
-                <w:sz w:val="17"/>
+                <w:sz w:val="24"/>
               </w:rPr>
               <w:t>3</w:t>
             </w:r>
@@ -4503,7 +4565,7 @@
                 <w:rFonts w:ascii="Times New Roman" w:hAnsi="Times New Roman"/>
                 <w:b w:val="0"/>
                 <w:i w:val="0"/>
-                <w:sz w:val="17"/>
+                <w:sz w:val="24"/>
               </w:rPr>
               <w:t>6</w:t>
             </w:r>
@@ -4529,7 +4591,7 @@
                 <w:rFonts w:ascii="Times New Roman" w:hAnsi="Times New Roman"/>
                 <w:b w:val="0"/>
                 <w:i w:val="0"/>
-                <w:sz w:val="17"/>
+                <w:sz w:val="24"/>
               </w:rPr>
               <w:t>5</w:t>
             </w:r>
@@ -4555,7 +4617,7 @@
                 <w:rFonts w:ascii="Times New Roman" w:hAnsi="Times New Roman"/>
                 <w:b w:val="0"/>
                 <w:i w:val="0"/>
-                <w:sz w:val="17"/>
+                <w:sz w:val="24"/>
               </w:rPr>
               <w:t>4 / 1 / 0</w:t>
             </w:r>
@@ -4581,7 +4643,7 @@
                 <w:rFonts w:ascii="Times New Roman" w:hAnsi="Times New Roman"/>
                 <w:b w:val="0"/>
                 <w:i w:val="0"/>
-                <w:sz w:val="17"/>
+                <w:sz w:val="24"/>
               </w:rPr>
               <w:t>1</w:t>
             </w:r>
@@ -4612,7 +4674,7 @@
                 <w:rFonts w:ascii="Times New Roman" w:hAnsi="Times New Roman"/>
                 <w:b w:val="0"/>
                 <w:i w:val="0"/>
-                <w:sz w:val="17"/>
+                <w:sz w:val="24"/>
               </w:rPr>
               <w:t>ADMIN</w:t>
             </w:r>
@@ -4638,7 +4700,7 @@
                 <w:rFonts w:ascii="Times New Roman" w:hAnsi="Times New Roman"/>
                 <w:b w:val="0"/>
                 <w:i w:val="0"/>
-                <w:sz w:val="17"/>
+                <w:sz w:val="24"/>
               </w:rPr>
               <w:t>/dashboard/admin/*, /api/admin/*</w:t>
             </w:r>
@@ -4664,7 +4726,7 @@
                 <w:rFonts w:ascii="Times New Roman" w:hAnsi="Times New Roman"/>
                 <w:b w:val="0"/>
                 <w:i w:val="0"/>
-                <w:sz w:val="17"/>
+                <w:sz w:val="24"/>
               </w:rPr>
               <w:t>audit_logs, blacklist</w:t>
             </w:r>
@@ -4690,7 +4752,7 @@
                 <w:rFonts w:ascii="Times New Roman" w:hAnsi="Times New Roman"/>
                 <w:b w:val="0"/>
                 <w:i w:val="0"/>
-                <w:sz w:val="17"/>
+                <w:sz w:val="24"/>
               </w:rPr>
               <w:t>4</w:t>
             </w:r>
@@ -4716,7 +4778,7 @@
                 <w:rFonts w:ascii="Times New Roman" w:hAnsi="Times New Roman"/>
                 <w:b w:val="0"/>
                 <w:i w:val="0"/>
-                <w:sz w:val="17"/>
+                <w:sz w:val="24"/>
               </w:rPr>
               <w:t>9</w:t>
             </w:r>
@@ -4742,7 +4804,7 @@
                 <w:rFonts w:ascii="Times New Roman" w:hAnsi="Times New Roman"/>
                 <w:b w:val="0"/>
                 <w:i w:val="0"/>
-                <w:sz w:val="17"/>
+                <w:sz w:val="24"/>
               </w:rPr>
               <w:t>8</w:t>
             </w:r>
@@ -4768,7 +4830,7 @@
                 <w:rFonts w:ascii="Times New Roman" w:hAnsi="Times New Roman"/>
                 <w:b w:val="0"/>
                 <w:i w:val="0"/>
-                <w:sz w:val="17"/>
+                <w:sz w:val="24"/>
               </w:rPr>
               <w:t>8 / 0 / 0</w:t>
             </w:r>
@@ -4794,7 +4856,7 @@
                 <w:rFonts w:ascii="Times New Roman" w:hAnsi="Times New Roman"/>
                 <w:b w:val="0"/>
                 <w:i w:val="0"/>
-                <w:sz w:val="17"/>
+                <w:sz w:val="24"/>
               </w:rPr>
               <w:t>1</w:t>
             </w:r>
@@ -4826,7 +4888,7 @@
                 <w:rFonts w:ascii="Times New Roman" w:hAnsi="Times New Roman"/>
                 <w:b/>
                 <w:i w:val="0"/>
-                <w:sz w:val="17"/>
+                <w:sz w:val="24"/>
               </w:rPr>
               <w:t>TỔNG CỘNG</w:t>
             </w:r>
@@ -4853,7 +4915,7 @@
                 <w:rFonts w:ascii="Times New Roman" w:hAnsi="Times New Roman"/>
                 <w:b/>
                 <w:i w:val="0"/>
-                <w:sz w:val="17"/>
+                <w:sz w:val="24"/>
               </w:rPr>
               <w:t>Toàn bộ route và API hệ thống</w:t>
             </w:r>
@@ -4880,7 +4942,7 @@
                 <w:rFonts w:ascii="Times New Roman" w:hAnsi="Times New Roman"/>
                 <w:b/>
                 <w:i w:val="0"/>
-                <w:sz w:val="17"/>
+                <w:sz w:val="24"/>
               </w:rPr>
               <w:t>Toàn bộ schema Prisma</w:t>
             </w:r>
@@ -4907,7 +4969,7 @@
                 <w:rFonts w:ascii="Times New Roman" w:hAnsi="Times New Roman"/>
                 <w:b/>
                 <w:i w:val="0"/>
-                <w:sz w:val="17"/>
+                <w:sz w:val="24"/>
               </w:rPr>
               <w:t>42</w:t>
             </w:r>
@@ -4934,7 +4996,7 @@
                 <w:rFonts w:ascii="Times New Roman" w:hAnsi="Times New Roman"/>
                 <w:b/>
                 <w:i w:val="0"/>
-                <w:sz w:val="17"/>
+                <w:sz w:val="24"/>
               </w:rPr>
               <w:t>105</w:t>
             </w:r>
@@ -4961,7 +5023,7 @@
                 <w:rFonts w:ascii="Times New Roman" w:hAnsi="Times New Roman"/>
                 <w:b/>
                 <w:i w:val="0"/>
-                <w:sz w:val="17"/>
+                <w:sz w:val="24"/>
               </w:rPr>
               <w:t>93</w:t>
             </w:r>
@@ -4988,7 +5050,7 @@
                 <w:rFonts w:ascii="Times New Roman" w:hAnsi="Times New Roman"/>
                 <w:b/>
                 <w:i w:val="0"/>
-                <w:sz w:val="17"/>
+                <w:sz w:val="24"/>
               </w:rPr>
               <w:t>89 / 4 / 0</w:t>
             </w:r>
@@ -5015,7 +5077,7 @@
                 <w:rFonts w:ascii="Times New Roman" w:hAnsi="Times New Roman"/>
                 <w:b/>
                 <w:i w:val="0"/>
-                <w:sz w:val="17"/>
+                <w:sz w:val="24"/>
               </w:rPr>
               <w:t>12</w:t>
             </w:r>

</xml_diff>